<commit_message>
docs: coordonnées de contact (Samuel) dans argumentaire + flyer
Intègre nom/téléphone/e-mail dans les sources .md et les générateurs,
Word régénérés (ARGUMENTAIRE_COMMERCIAL.docx, ARGUMENTAIRE_FLYER.docx).

Co-Authored-By: Claude Opus 4.8 <noreply@anthropic.com>
</commit_message>
<xml_diff>
--- a/ARGUMENTAIRE_FLYER.docx
+++ b/ARGUMENTAIRE_FLYER.docx
@@ -381,13 +381,13 @@
       </w:r>
       <w:r>
         <w:rPr>
-          <w:i/>
-          <w:iCs/>
-          <w:color w:val="555555"/>
+          <w:b/>
+          <w:bCs/>
+          <w:color w:val="0047AB"/>
           <w:sz w:val="20"/>
           <w:szCs w:val="20"/>
         </w:rPr>
-        <w:t xml:space="preserve">[votre nom / téléphone / e-mail]</w:t>
+        <w:t xml:space="preserve">Samuel · 034 21 890 51 · hariniainasamuelandrianirina@gmail.com</w:t>
       </w:r>
     </w:p>
     <w:p>

</xml_diff>